<commit_message>
docs: bổ sung chức năng Admin và chỉnh phạm vi tài liệu
</commit_message>
<xml_diff>
--- a/docs/chuc-nang-du-an-web.docx
+++ b/docs/chuc-nang-du-an-web.docx
@@ -20,12 +20,12 @@
         <w:t xml:space="preserve">TÀI LIỆU MÔ TẢ </w:t>
       </w:r>
       <w:r>
-        <w:t>PHẠM VI WEBSITE MẠNG XÃ HỘI</w:t>
-      </w:r>
-    </w:p>
-    <w:p>
-      <w:r>
-        <w:t>Ngày lập: 26/10/2026  |  Phiên bản tài liệu: 1.0</w:t>
+        <w:t>WEBSITE MẠNG XÃ HỘI VÀ TRANG ADMIN</w:t>
+      </w:r>
+    </w:p>
+    <w:p>
+      <w:r>
+        <w:t>Ngày cập nhật: 26/10/2026  |  Phiên bản tài liệu: 1.1</w:t>
       </w:r>
     </w:p>
     <w:p>
@@ -38,7 +38,7 @@
     </w:p>
     <w:p>
       <w:r>
-        <w:t>Fookbase Light là website mạng xã hội phục vụ chia sẻ nội dung, kết nối người dùng và xây dựng cộng đồng. Tài liệu này mô tả các thao tác đã được thể hiện trong giao diện frontend/web và phân chia theo vai trò trong sản phẩm.</w:t>
+        <w:t>Fookbase Light gồm website mạng xã hội phục vụ người dùng và trang Admin phục vụ quản trị cộng đồng. Tài liệu mô tả các thao tác đã được thể hiện trong frontend/web và frontend/admin, chia riêng chức năng chính và chức năng phụ cho từng khu vực.</w:t>
       </w:r>
     </w:p>
     <w:tbl>
@@ -93,7 +93,7 @@
           </w:tcPr>
           <w:p>
             <w:r>
-              <w:t>Chức năng chính</w:t>
+              <w:t>Website người dùng</w:t>
             </w:r>
           </w:p>
         </w:tc>
@@ -103,7 +103,7 @@
           </w:tcPr>
           <w:p>
             <w:r>
-              <w:t>12 nhóm: tài khoản, hồ sơ, quan hệ, bảng tin/bài viết, tương tác, Stories, Reels, nhóm, Pages, tìm kiếm, thông báo và chat nổi.</w:t>
+              <w:t>12 nhóm chức năng chính (CN01–CN12) và 12 nhóm chức năng phụ (CP01–CP12): kết nối, chia sẻ nội dung và các tiện ích mạng xã hội.</w:t>
             </w:r>
           </w:p>
         </w:tc>
@@ -118,7 +118,7 @@
           </w:tcPr>
           <w:p>
             <w:r>
-              <w:t>Chức năng phụ</w:t>
+              <w:t>Trang Admin</w:t>
             </w:r>
           </w:p>
         </w:tc>
@@ -128,7 +128,7 @@
           </w:tcPr>
           <w:p>
             <w:r>
-              <w:t>12 nhóm bổ trợ: lưu/ghim, gợi ý bạn bè, album ảnh, sự kiện, kỷ niệm, sinh nhật, AI, trò chơi, bảo mật, riêng tư, báo cáo và giao diện.</w:t>
+              <w:t>6 nhóm chức năng chính (AD01–AD06) và 4 nhóm chức năng phụ (AP01–AP04): truy cập quản trị, tổng quan, quản lý tài khoản và xử lý báo cáo.</w:t>
             </w:r>
           </w:p>
         </w:tc>
@@ -153,7 +153,7 @@
           </w:tcPr>
           <w:p>
             <w:r>
-              <w:t>Khách truy cập; thành viên đã đăng nhập; người quản lý nhóm hoặc Page trong phạm vi quyền được cấp.</w:t>
+              <w:t>Khách truy cập; thành viên; người quản lý nhóm/Page; quản trị viên có vai trò Admin.</w:t>
             </w:r>
           </w:p>
         </w:tc>
@@ -168,7 +168,7 @@
           </w:tcPr>
           <w:p>
             <w:r>
-              <w:t>Ngoài phạm vi</w:t>
+              <w:t>Phạm vi ứng dụng</w:t>
             </w:r>
           </w:p>
         </w:tc>
@@ -178,7 +178,7 @@
           </w:tcPr>
           <w:p>
             <w:r>
-              <w:t>Ứng dụng Admin, mobile, Zola Mobile và các màn hình của ứng dụng Zola Light riêng.</w:t>
+              <w:t>Website người dùng và trang Admin. Chat nổi thuộc website; các màn hình của ứng dụng Zola Light riêng được trình bày ở phần lưu ý phạm vi.</w:t>
             </w:r>
           </w:p>
         </w:tc>
@@ -207,7 +207,7 @@
     </w:p>
     <w:p>
       <w:r>
-        <w:t>Nội dung được đối chiếu với route, màn hình, thành phần giao diện và các lời gọi API từ web tại thời điểm lập tài liệu. Đây là mô tả theo mã nguồn, không phải biên bản kiểm thử vận hành hay cam kết mọi chức năng đều hoạt động trên môi trường triển khai.</w:t>
+        <w:t>Nội dung được đối chiếu với route, màn hình, thành phần giao diện và lời gọi API từ website và Admin tại thời điểm cập nhật. Đây là mô tả theo mã nguồn, không phải biên bản kiểm thử vận hành hay cam kết mọi chức năng đều hoạt động trên môi trường triển khai.</w:t>
       </w:r>
     </w:p>
     <w:p>
@@ -225,7 +225,7 @@
         <w:pStyle w:val="Heading1"/>
       </w:pPr>
       <w:r>
-        <w:t>2. Chức năng chính</w:t>
+        <w:t>2. Website — Chức năng chính</w:t>
       </w:r>
     </w:p>
     <w:p>
@@ -478,7 +478,7 @@
         <w:pStyle w:val="Heading1"/>
       </w:pPr>
       <w:r>
-        <w:t>2. Chức năng chính</w:t>
+        <w:t>2. Website — Chức năng chính</w:t>
       </w:r>
     </w:p>
     <w:p>
@@ -739,7 +739,7 @@
         <w:pStyle w:val="Heading1"/>
       </w:pPr>
       <w:r>
-        <w:t>2. Chức năng chính</w:t>
+        <w:t>2. Website — Chức năng chính</w:t>
       </w:r>
     </w:p>
     <w:p>
@@ -1000,7 +1000,7 @@
         <w:pStyle w:val="Heading1"/>
       </w:pPr>
       <w:r>
-        <w:t>2. Chức năng chính</w:t>
+        <w:t>2. Website — Chức năng chính</w:t>
       </w:r>
     </w:p>
     <w:p>
@@ -1245,7 +1245,7 @@
         <w:pStyle w:val="Heading1"/>
       </w:pPr>
       <w:r>
-        <w:t>3. Chức năng phụ và mở rộng</w:t>
+        <w:t>3. Website — Chức năng phụ</w:t>
       </w:r>
     </w:p>
     <w:p>
@@ -1487,7 +1487,7 @@
         <w:pStyle w:val="Heading1"/>
       </w:pPr>
       <w:r>
-        <w:t>3. Chức năng phụ và mở rộng</w:t>
+        <w:t>3. Website — Chức năng phụ</w:t>
       </w:r>
     </w:p>
     <w:p>
@@ -1729,7 +1729,7 @@
         <w:pStyle w:val="Heading1"/>
       </w:pPr>
       <w:r>
-        <w:t>3. Chức năng phụ và mở rộng</w:t>
+        <w:t>3. Website — Chức năng phụ</w:t>
       </w:r>
     </w:p>
     <w:p>
@@ -1904,7 +1904,7 @@
         <w:t xml:space="preserve">Vai trò: </w:t>
       </w:r>
       <w:r>
-        <w:t>Chuyển phản ánh đến hệ thống kiểm duyệt; xử lý báo cáo nằm ở ứng dụng Admin riêng.</w:t>
+        <w:t>Chuyển phản ánh đến trang Admin để quản trị viên xử lý; xem AD04 và AD05.</w:t>
       </w:r>
     </w:p>
     <w:p>
@@ -1971,12 +1971,12 @@
         <w:pStyle w:val="Heading1"/>
       </w:pPr>
       <w:r>
-        <w:t>4. Phạm vi thực tế và nguồn đối chiếu</w:t>
-      </w:r>
-    </w:p>
-    <w:p>
-      <w:r>
-        <w:t>Các lưu ý để sử dụng danh sách chức năng đúng với website hiện tại.</w:t>
+        <w:t>4. Admin — Chức năng chính</w:t>
+      </w:r>
+    </w:p>
+    <w:p>
+      <w:r>
+        <w:t>Phần 1/2 — Truy cập, tổng quan và tra cứu tài khoản</w:t>
       </w:r>
     </w:p>
     <w:p>
@@ -1984,7 +1984,723 @@
         <w:pStyle w:val="Heading2"/>
       </w:pPr>
       <w:r>
-        <w:t>4.1. Nhắn tin trên web và Zola Light</w:t>
+        <w:t>AD01 · Đăng nhập và kiểm soát quyền quản trị</w:t>
+      </w:r>
+    </w:p>
+    <w:p>
+      <w:r>
+        <w:rPr>
+          <w:b/>
+        </w:rPr>
+        <w:t xml:space="preserve">Mục đích: </w:t>
+      </w:r>
+      <w:r>
+        <w:t>Giới hạn quyền truy cập trang quản trị cho tài khoản được cấp vai trò Admin.</w:t>
+      </w:r>
+    </w:p>
+    <w:p>
+      <w:pPr>
+        <w:pStyle w:val="ListBullet"/>
+      </w:pPr>
+      <w:r>
+        <w:t>Đăng nhập bằng email và mật khẩu của tài khoản quản trị.</w:t>
+      </w:r>
+    </w:p>
+    <w:p>
+      <w:pPr>
+        <w:pStyle w:val="ListBullet"/>
+      </w:pPr>
+      <w:r>
+        <w:t>Kiểm tra vai trò Admin trước khi cho phép truy cập bảng điều khiển.</w:t>
+      </w:r>
+    </w:p>
+    <w:p>
+      <w:pPr>
+        <w:pStyle w:val="ListBullet"/>
+      </w:pPr>
+      <w:r>
+        <w:t>Hiển thị tài khoản quản trị đang sử dụng và cho phép đăng xuất.</w:t>
+      </w:r>
+    </w:p>
+    <w:p>
+      <w:pPr>
+        <w:pStyle w:val="ListBullet"/>
+      </w:pPr>
+      <w:r>
+        <w:t>Duy trì phiên đăng nhập và kiểm tra lại quyền khi làm mới phiên.</w:t>
+      </w:r>
+    </w:p>
+    <w:p>
+      <w:r>
+        <w:rPr>
+          <w:b/>
+        </w:rPr>
+        <w:t xml:space="preserve">Màn hình: </w:t>
+      </w:r>
+      <w:r>
+        <w:t>Trang đăng nhập Admin; menu tài khoản quản trị</w:t>
+      </w:r>
+    </w:p>
+    <w:p>
+      <w:r>
+        <w:rPr>
+          <w:b/>
+        </w:rPr>
+        <w:t xml:space="preserve">Kết quả/phạm vi: </w:t>
+      </w:r>
+      <w:r>
+        <w:t>Chỉ tài khoản có vai trò Admin được truy cập các chức năng quản trị; giao diện không cung cấp thao tác tự cấp quyền Admin.</w:t>
+      </w:r>
+    </w:p>
+    <w:p>
+      <w:pPr>
+        <w:pStyle w:val="Heading2"/>
+      </w:pPr>
+      <w:r>
+        <w:t>AD02 · Bảng điều khiển tổng quan</w:t>
+      </w:r>
+    </w:p>
+    <w:p>
+      <w:r>
+        <w:rPr>
+          <w:b/>
+        </w:rPr>
+        <w:t xml:space="preserve">Mục đích: </w:t>
+      </w:r>
+      <w:r>
+        <w:t>Cung cấp số liệu tóm tắt để quản trị viên nắm tình hình cộng đồng.</w:t>
+      </w:r>
+    </w:p>
+    <w:p>
+      <w:pPr>
+        <w:pStyle w:val="ListBullet"/>
+      </w:pPr>
+      <w:r>
+        <w:t>Xem tổng số tài khoản đã đăng ký và số tài khoản đang được kích hoạt.</w:t>
+      </w:r>
+    </w:p>
+    <w:p>
+      <w:pPr>
+        <w:pStyle w:val="ListBullet"/>
+      </w:pPr>
+      <w:r>
+        <w:t>Xem số bài viết đang hiển thị và số báo cáo đang chờ xử lý.</w:t>
+      </w:r>
+    </w:p>
+    <w:p>
+      <w:pPr>
+        <w:pStyle w:val="ListBullet"/>
+      </w:pPr>
+      <w:r>
+        <w:t>Xem tỷ lệ tài khoản đang được kích hoạt và số tài khoản bị vô hiệu hóa.</w:t>
+      </w:r>
+    </w:p>
+    <w:p>
+      <w:pPr>
+        <w:pStyle w:val="ListBullet"/>
+      </w:pPr>
+      <w:r>
+        <w:t>Theo dõi khối lượng báo cáo cần ưu tiên và chuyển nhanh sang hàng chờ.</w:t>
+      </w:r>
+    </w:p>
+    <w:p>
+      <w:r>
+        <w:rPr>
+          <w:b/>
+        </w:rPr>
+        <w:t xml:space="preserve">Màn hình: </w:t>
+      </w:r>
+      <w:r>
+        <w:t>Trang Admin — thẻ Tổng quan</w:t>
+      </w:r>
+    </w:p>
+    <w:p>
+      <w:r>
+        <w:rPr>
+          <w:b/>
+        </w:rPr>
+        <w:t xml:space="preserve">Kết quả/phạm vi: </w:t>
+      </w:r>
+      <w:r>
+        <w:t>Tổng quan phản ánh dữ liệu do backend cung cấp. Số tài khoản được kích hoạt không phải số người đang trực tuyến; biểu đồ chi tiết được mô tả ở AP01.</w:t>
+      </w:r>
+    </w:p>
+    <w:p>
+      <w:pPr>
+        <w:pStyle w:val="Heading2"/>
+      </w:pPr>
+      <w:r>
+        <w:t>AD03 · Tra cứu và theo dõi tài khoản người dùng</w:t>
+      </w:r>
+    </w:p>
+    <w:p>
+      <w:r>
+        <w:rPr>
+          <w:b/>
+        </w:rPr>
+        <w:t xml:space="preserve">Mục đích: </w:t>
+      </w:r>
+      <w:r>
+        <w:t>Cho phép quản trị viên xác định tài khoản và xem tình trạng hiện tại.</w:t>
+      </w:r>
+    </w:p>
+    <w:p>
+      <w:pPr>
+        <w:pStyle w:val="ListBullet"/>
+      </w:pPr>
+      <w:r>
+        <w:t>Xem danh sách tài khoản, tổng số kết quả và tải thêm người dùng.</w:t>
+      </w:r>
+    </w:p>
+    <w:p>
+      <w:pPr>
+        <w:pStyle w:val="ListBullet"/>
+      </w:pPr>
+      <w:r>
+        <w:t>Tìm tài khoản theo từ khóa qua ô tìm kiếm.</w:t>
+      </w:r>
+    </w:p>
+    <w:p>
+      <w:pPr>
+        <w:pStyle w:val="ListBullet"/>
+      </w:pPr>
+      <w:r>
+        <w:t>Xem username, email, vai trò, ngày tham gia và trạng thái hoạt động của tài khoản.</w:t>
+      </w:r>
+    </w:p>
+    <w:p>
+      <w:pPr>
+        <w:pStyle w:val="ListBullet"/>
+      </w:pPr>
+      <w:r>
+        <w:t>Xem số lần cảnh cáo, thời hạn đình chỉ và trạng thái bị vô hiệu hóa do kiểm duyệt.</w:t>
+      </w:r>
+    </w:p>
+    <w:p>
+      <w:r>
+        <w:rPr>
+          <w:b/>
+        </w:rPr>
+        <w:t xml:space="preserve">Màn hình: </w:t>
+      </w:r>
+      <w:r>
+        <w:t>Trang Admin — thẻ Người dùng</w:t>
+      </w:r>
+    </w:p>
+    <w:p>
+      <w:r>
+        <w:rPr>
+          <w:b/>
+        </w:rPr>
+        <w:t xml:space="preserve">Kết quả/phạm vi: </w:t>
+      </w:r>
+      <w:r>
+        <w:t>Cung cấp thông tin để quản trị viên quyết định biện pháp xử lý ở AD06; xem vai trò không đồng nghĩa có chức năng chỉnh sửa vai trò.</w:t>
+      </w:r>
+    </w:p>
+    <w:p>
+      <w:r>
+        <w:br w:type="page"/>
+      </w:r>
+    </w:p>
+    <w:p>
+      <w:pPr>
+        <w:pStyle w:val="Heading1"/>
+      </w:pPr>
+      <w:r>
+        <w:t>4. Admin — Chức năng chính</w:t>
+      </w:r>
+    </w:p>
+    <w:p>
+      <w:r>
+        <w:t>Phần 2/2 — Hàng chờ báo cáo và xử lý vi phạm</w:t>
+      </w:r>
+    </w:p>
+    <w:p>
+      <w:pPr>
+        <w:pStyle w:val="Heading2"/>
+      </w:pPr>
+      <w:r>
+        <w:t>AD04 · Tiếp nhận và quản lý hàng chờ báo cáo</w:t>
+      </w:r>
+    </w:p>
+    <w:p>
+      <w:r>
+        <w:rPr>
+          <w:b/>
+        </w:rPr>
+        <w:t xml:space="preserve">Mục đích: </w:t>
+      </w:r>
+      <w:r>
+        <w:t>Tập trung các báo cáo do người dùng gửi để quản trị viên xem xét.</w:t>
+      </w:r>
+    </w:p>
+    <w:p>
+      <w:pPr>
+        <w:pStyle w:val="ListBullet"/>
+      </w:pPr>
+      <w:r>
+        <w:t>Xem danh sách báo cáo và tổng số kết quả; tải thêm báo cáo khi có.</w:t>
+      </w:r>
+    </w:p>
+    <w:p>
+      <w:pPr>
+        <w:pStyle w:val="ListBullet"/>
+      </w:pPr>
+      <w:r>
+        <w:t>Lọc Tất cả hoặc theo trạng thái chờ xử lý, đã xem xét, đã giải quyết và đã bác bỏ.</w:t>
+      </w:r>
+    </w:p>
+    <w:p>
+      <w:pPr>
+        <w:pStyle w:val="ListBullet"/>
+      </w:pPr>
+      <w:r>
+        <w:t>Xem loại đối tượng bị báo cáo: bài viết hoặc người dùng.</w:t>
+      </w:r>
+    </w:p>
+    <w:p>
+      <w:pPr>
+        <w:pStyle w:val="ListBullet"/>
+      </w:pPr>
+      <w:r>
+        <w:t>Xem lý do, mô tả bổ sung, thời điểm tạo, mã đối tượng và mã người gửi báo cáo.</w:t>
+      </w:r>
+    </w:p>
+    <w:p>
+      <w:r>
+        <w:rPr>
+          <w:b/>
+        </w:rPr>
+        <w:t xml:space="preserve">Màn hình: </w:t>
+      </w:r>
+      <w:r>
+        <w:t>Trang Admin — thẻ Báo cáo</w:t>
+      </w:r>
+    </w:p>
+    <w:p>
+      <w:r>
+        <w:rPr>
+          <w:b/>
+        </w:rPr>
+        <w:t xml:space="preserve">Kết quả/phạm vi: </w:t>
+      </w:r>
+      <w:r>
+        <w:t>Quản trị viên đọc thông tin báo cáo ngay trong danh sách. Giao diện hiện tại không được mặc định là có màn hình xem trước đầy đủ nội dung bị báo cáo.</w:t>
+      </w:r>
+    </w:p>
+    <w:p>
+      <w:pPr>
+        <w:pStyle w:val="Heading2"/>
+      </w:pPr>
+      <w:r>
+        <w:t>AD05 · Xử lý vi phạm từ báo cáo</w:t>
+      </w:r>
+    </w:p>
+    <w:p>
+      <w:r>
+        <w:rPr>
+          <w:b/>
+        </w:rPr>
+        <w:t xml:space="preserve">Mục đích: </w:t>
+      </w:r>
+      <w:r>
+        <w:t>Cho phép quản trị viên ra quyết định đối với báo cáo đang chờ xử lý.</w:t>
+      </w:r>
+    </w:p>
+    <w:p>
+      <w:pPr>
+        <w:pStyle w:val="ListBullet"/>
+      </w:pPr>
+      <w:r>
+        <w:t>Cảnh cáo tài khoản liên quan đến báo cáo.</w:t>
+      </w:r>
+    </w:p>
+    <w:p>
+      <w:pPr>
+        <w:pStyle w:val="ListBullet"/>
+      </w:pPr>
+      <w:r>
+        <w:t>Đình chỉ tài khoản liên quan theo số giờ do quản trị viên nhập.</w:t>
+      </w:r>
+    </w:p>
+    <w:p>
+      <w:pPr>
+        <w:pStyle w:val="ListBullet"/>
+      </w:pPr>
+      <w:r>
+        <w:t>Gỡ nội dung khi đối tượng báo cáo là bài viết.</w:t>
+      </w:r>
+    </w:p>
+    <w:p>
+      <w:pPr>
+        <w:pStyle w:val="ListBullet"/>
+      </w:pPr>
+      <w:r>
+        <w:t>Bác bỏ báo cáo khi không áp dụng biện pháp xử lý vi phạm.</w:t>
+      </w:r>
+    </w:p>
+    <w:p>
+      <w:pPr>
+        <w:pStyle w:val="ListBullet"/>
+      </w:pPr>
+      <w:r>
+        <w:t>Xác nhận trước khi thực hiện; tải lại hàng chờ và số liệu tổng quan sau xử lý.</w:t>
+      </w:r>
+    </w:p>
+    <w:p>
+      <w:r>
+        <w:rPr>
+          <w:b/>
+        </w:rPr>
+        <w:t xml:space="preserve">Màn hình: </w:t>
+      </w:r>
+      <w:r>
+        <w:t>Trang Admin — các nút thao tác trên báo cáo chờ xử lý</w:t>
+      </w:r>
+    </w:p>
+    <w:p>
+      <w:r>
+        <w:rPr>
+          <w:b/>
+        </w:rPr>
+        <w:t xml:space="preserve">Kết quả/phạm vi: </w:t>
+      </w:r>
+      <w:r>
+        <w:t>Các nút xử lý chỉ xuất hiện với báo cáo chờ xử lý. Thời hạn đình chỉ nhập bằng số giờ nguyên trong phạm vi giao diện cho phép.</w:t>
+      </w:r>
+    </w:p>
+    <w:p>
+      <w:pPr>
+        <w:pStyle w:val="Heading2"/>
+      </w:pPr>
+      <w:r>
+        <w:t>AD06 · Áp dụng và gỡ biện pháp xử lý tài khoản</w:t>
+      </w:r>
+    </w:p>
+    <w:p>
+      <w:r>
+        <w:rPr>
+          <w:b/>
+        </w:rPr>
+        <w:t xml:space="preserve">Mục đích: </w:t>
+      </w:r>
+      <w:r>
+        <w:t>Cho phép quản trị viên quản lý vi phạm trực tiếp từ danh sách người dùng.</w:t>
+      </w:r>
+    </w:p>
+    <w:p>
+      <w:pPr>
+        <w:pStyle w:val="ListBullet"/>
+      </w:pPr>
+      <w:r>
+        <w:t>Cảnh cáo tài khoản người dùng.</w:t>
+      </w:r>
+    </w:p>
+    <w:p>
+      <w:pPr>
+        <w:pStyle w:val="ListBullet"/>
+      </w:pPr>
+      <w:r>
+        <w:t>Đình chỉ tài khoản theo số giờ; gỡ đình chỉ khi tài khoản đang bị đình chỉ.</w:t>
+      </w:r>
+    </w:p>
+    <w:p>
+      <w:pPr>
+        <w:pStyle w:val="ListBullet"/>
+      </w:pPr>
+      <w:r>
+        <w:t>Vô hiệu hóa tài khoản do kiểm duyệt; khôi phục tài khoản đã bị vô hiệu hóa theo cơ chế này.</w:t>
+      </w:r>
+    </w:p>
+    <w:p>
+      <w:pPr>
+        <w:pStyle w:val="ListBullet"/>
+      </w:pPr>
+      <w:r>
+        <w:t>Cập nhật số cảnh cáo, thời hạn đình chỉ, trạng thái tài khoản và số liệu tổng quan sau thao tác.</w:t>
+      </w:r>
+    </w:p>
+    <w:p>
+      <w:r>
+        <w:rPr>
+          <w:b/>
+        </w:rPr>
+        <w:t xml:space="preserve">Màn hình: </w:t>
+      </w:r>
+      <w:r>
+        <w:t>Trang Admin — thẻ Người dùng, khu vực thao tác tài khoản</w:t>
+      </w:r>
+    </w:p>
+    <w:p>
+      <w:r>
+        <w:rPr>
+          <w:b/>
+        </w:rPr>
+        <w:t xml:space="preserve">Kết quả/phạm vi: </w:t>
+      </w:r>
+      <w:r>
+        <w:t>Giao diện không hiển thị các nút xử lý này trên tài khoản có vai trò Admin. Việc khôi phục tương ứng với trạng thái vô hiệu hóa do kiểm duyệt đang được hiển thị.</w:t>
+      </w:r>
+    </w:p>
+    <w:p>
+      <w:r>
+        <w:br w:type="page"/>
+      </w:r>
+    </w:p>
+    <w:p>
+      <w:pPr>
+        <w:pStyle w:val="Heading1"/>
+      </w:pPr>
+      <w:r>
+        <w:t>5. Admin — Chức năng phụ</w:t>
+      </w:r>
+    </w:p>
+    <w:p>
+      <w:r>
+        <w:t>Phân tích dữ liệu, theo dõi báo cáo và hỗ trợ công việc quản trị.</w:t>
+      </w:r>
+    </w:p>
+    <w:p>
+      <w:pPr>
+        <w:pStyle w:val="Heading2"/>
+      </w:pPr>
+      <w:r>
+        <w:t>AP01 · Biểu đồ và phân tích hoạt động cộng đồng</w:t>
+      </w:r>
+    </w:p>
+    <w:p>
+      <w:pPr>
+        <w:pStyle w:val="ListBullet"/>
+      </w:pPr>
+      <w:r>
+        <w:t>Chọn khoảng 7 hoặc 30 ngày để xem số tài khoản mới, bài viết mới và báo cáo mới.</w:t>
+      </w:r>
+    </w:p>
+    <w:p>
+      <w:pPr>
+        <w:pStyle w:val="ListBullet"/>
+      </w:pPr>
+      <w:r>
+        <w:t>Xem biểu đồ tài khoản/bài viết theo ngày, biểu đồ số báo cáo mới và phân bố báo cáo theo trạng thái.</w:t>
+      </w:r>
+    </w:p>
+    <w:p>
+      <w:pPr>
+        <w:pStyle w:val="ListBullet"/>
+      </w:pPr>
+      <w:r>
+        <w:t>Mở bảng dữ liệu chi tiết theo ngày để đối chiếu biểu đồ; ngày thống kê được ghi chú theo UTC.</w:t>
+      </w:r>
+    </w:p>
+    <w:p>
+      <w:r>
+        <w:rPr>
+          <w:b/>
+        </w:rPr>
+        <w:t xml:space="preserve">Màn hình: </w:t>
+      </w:r>
+      <w:r>
+        <w:t>Trang Admin — thẻ Tổng quan</w:t>
+      </w:r>
+    </w:p>
+    <w:p>
+      <w:r>
+        <w:rPr>
+          <w:b/>
+        </w:rPr>
+        <w:t xml:space="preserve">Vai trò: </w:t>
+      </w:r>
+      <w:r>
+        <w:t>Bổ sung phân tích xu hướng bên cạnh các chỉ số tổng quan ở AD02.</w:t>
+      </w:r>
+    </w:p>
+    <w:p>
+      <w:pPr>
+        <w:pStyle w:val="Heading2"/>
+      </w:pPr>
+      <w:r>
+        <w:t>AP02 · Nhắc có báo cáo mới và truy cập nhanh hàng chờ</w:t>
+      </w:r>
+    </w:p>
+    <w:p>
+      <w:pPr>
+        <w:pStyle w:val="ListBullet"/>
+      </w:pPr>
+      <w:r>
+        <w:t>Hiển thị số báo cáo đang chờ ở thanh điều hướng.</w:t>
+      </w:r>
+    </w:p>
+    <w:p>
+      <w:pPr>
+        <w:pStyle w:val="ListBullet"/>
+      </w:pPr>
+      <w:r>
+        <w:t>Kiểm tra báo cáo chờ định kỳ khi trang đang hiển thị và đánh dấu khi phát hiện báo cáo mới.</w:t>
+      </w:r>
+    </w:p>
+    <w:p>
+      <w:pPr>
+        <w:pStyle w:val="ListBullet"/>
+      </w:pPr>
+      <w:r>
+        <w:t>Bấm biểu tượng chuông để chuyển sang danh sách báo cáo chờ và xóa chỉ báo báo cáo mới.</w:t>
+      </w:r>
+    </w:p>
+    <w:p>
+      <w:r>
+        <w:rPr>
+          <w:b/>
+        </w:rPr>
+        <w:t xml:space="preserve">Màn hình: </w:t>
+      </w:r>
+      <w:r>
+        <w:t>Biểu tượng chuông; thanh bên Admin</w:t>
+      </w:r>
+    </w:p>
+    <w:p>
+      <w:r>
+        <w:rPr>
+          <w:b/>
+        </w:rPr>
+        <w:t xml:space="preserve">Vai trò: </w:t>
+      </w:r>
+      <w:r>
+        <w:t>Giúp quản trị viên theo dõi hàng chờ; cơ chế hiện tại kiểm tra định kỳ, không phải thông báo đẩy thời gian thực.</w:t>
+      </w:r>
+    </w:p>
+    <w:p>
+      <w:pPr>
+        <w:pStyle w:val="Heading2"/>
+      </w:pPr>
+      <w:r>
+        <w:t>AP03 · Làm mới dữ liệu và duy trì phiên làm việc</w:t>
+      </w:r>
+    </w:p>
+    <w:p>
+      <w:pPr>
+        <w:pStyle w:val="ListBullet"/>
+      </w:pPr>
+      <w:r>
+        <w:t>Làm mới số liệu tổng quan, báo cáo và danh sách người dùng bằng nút Làm mới.</w:t>
+      </w:r>
+    </w:p>
+    <w:p>
+      <w:pPr>
+        <w:pStyle w:val="ListBullet"/>
+      </w:pPr>
+      <w:r>
+        <w:t>Thử lại khi tải danh sách hoặc dữ liệu thất bại; hiển thị tiến trình và lỗi thao tác.</w:t>
+      </w:r>
+    </w:p>
+    <w:p>
+      <w:pPr>
+        <w:pStyle w:val="ListBullet"/>
+      </w:pPr>
+      <w:r>
+        <w:t>Tự làm mới phiên đăng nhập; hiển thị trạng thái kết nối và nút thử lại khi chưa thể làm mới phiên.</w:t>
+      </w:r>
+    </w:p>
+    <w:p>
+      <w:r>
+        <w:rPr>
+          <w:b/>
+        </w:rPr>
+        <w:t xml:space="preserve">Màn hình: </w:t>
+      </w:r>
+      <w:r>
+        <w:t>Nút Làm mới; thông báo kết nối trên trang Admin</w:t>
+      </w:r>
+    </w:p>
+    <w:p>
+      <w:r>
+        <w:rPr>
+          <w:b/>
+        </w:rPr>
+        <w:t xml:space="preserve">Vai trò: </w:t>
+      </w:r>
+      <w:r>
+        <w:t>Hỗ trợ quản trị viên tiếp tục công việc và cập nhật dữ liệu đang xem.</w:t>
+      </w:r>
+    </w:p>
+    <w:p>
+      <w:pPr>
+        <w:pStyle w:val="Heading2"/>
+      </w:pPr>
+      <w:r>
+        <w:t>AP04 · Tùy chỉnh giao diện quản trị</w:t>
+      </w:r>
+    </w:p>
+    <w:p>
+      <w:pPr>
+        <w:pStyle w:val="ListBullet"/>
+      </w:pPr>
+      <w:r>
+        <w:t>Chuyển ngôn ngữ tiếng Việt/tiếng Anh và chế độ giao diện sáng/tối.</w:t>
+      </w:r>
+    </w:p>
+    <w:p>
+      <w:pPr>
+        <w:pStyle w:val="ListBullet"/>
+      </w:pPr>
+      <w:r>
+        <w:t>Chuyển nhanh giữa Tổng quan, Báo cáo và Người dùng.</w:t>
+      </w:r>
+    </w:p>
+    <w:p>
+      <w:pPr>
+        <w:pStyle w:val="ListBullet"/>
+      </w:pPr>
+      <w:r>
+        <w:t>Hiển thị tên tài khoản quản trị, ngày hiện tại và định dạng số/ngày theo ngôn ngữ đã chọn.</w:t>
+      </w:r>
+    </w:p>
+    <w:p>
+      <w:r>
+        <w:rPr>
+          <w:b/>
+        </w:rPr>
+        <w:t xml:space="preserve">Màn hình: </w:t>
+      </w:r>
+      <w:r>
+        <w:t>Trang đăng nhập Admin; thanh công cụ và menu điều hướng</w:t>
+      </w:r>
+    </w:p>
+    <w:p>
+      <w:r>
+        <w:rPr>
+          <w:b/>
+        </w:rPr>
+        <w:t xml:space="preserve">Vai trò: </w:t>
+      </w:r>
+      <w:r>
+        <w:t>Cá nhân hóa cách hiển thị và hỗ trợ điều hướng công việc quản trị.</w:t>
+      </w:r>
+    </w:p>
+    <w:p>
+      <w:r>
+        <w:br w:type="page"/>
+      </w:r>
+    </w:p>
+    <w:p>
+      <w:pPr>
+        <w:pStyle w:val="Heading1"/>
+      </w:pPr>
+      <w:r>
+        <w:t>6. Phạm vi thực tế và nguồn đối chiếu</w:t>
+      </w:r>
+    </w:p>
+    <w:p>
+      <w:r>
+        <w:t>Các lưu ý để sử dụng danh sách chức năng đúng với website và trang quản trị hiện tại.</w:t>
+      </w:r>
+    </w:p>
+    <w:p>
+      <w:pPr>
+        <w:pStyle w:val="Heading2"/>
+      </w:pPr>
+      <w:r>
+        <w:t>6.1. Nhắn tin trên web và Zola Light</w:t>
       </w:r>
     </w:p>
     <w:p>
@@ -2002,7 +2718,7 @@
         <w:pStyle w:val="Heading2"/>
       </w:pPr>
       <w:r>
-        <w:t>4.2. Phân biệt giao diện web với khả năng của API</w:t>
+        <w:t>6.2. Thao tác đã có trên giao diện</w:t>
       </w:r>
     </w:p>
     <w:p>
@@ -2012,7 +2728,7 @@
     </w:p>
     <w:p>
       <w:r>
-        <w:t>Website cho phép gửi báo cáo vi phạm. Việc xử lý báo cáo, cảnh cáo, đình chỉ tài khoản và dashboard quản trị thuộc frontend/admin, ngoài phạm vi tài liệu này.</w:t>
+        <w:t>Người dùng gửi báo cáo từ website; quản trị viên xem và xử lý ở trang Admin (AD04–AD06). Giao diện Admin hiện chưa có điều khiển xem lịch sử kiểm duyệt đầy đủ, gán vai trò tài khoản hoặc đổi tùy ý trạng thái báo cáo; không tính các thao tác đó là chức năng giao diện đã có.</w:t>
       </w:r>
     </w:p>
     <w:p>
@@ -2020,7 +2736,7 @@
         <w:pStyle w:val="Heading2"/>
       </w:pPr>
       <w:r>
-        <w:t>4.3. Các chức năng phụ thuộc cấu hình</w:t>
+        <w:t>6.3. Các chức năng phụ thuộc cấu hình</w:t>
       </w:r>
     </w:p>
     <w:p>
@@ -2033,7 +2749,7 @@
         <w:pStyle w:val="Heading2"/>
       </w:pPr>
       <w:r>
-        <w:t>4.4. Nguồn trong repository</w:t>
+        <w:t>6.4. Nguồn trong repository</w:t>
       </w:r>
     </w:p>
     <w:tbl>
@@ -2253,10 +2969,110 @@
           </w:p>
         </w:tc>
       </w:tr>
+      <w:tr>
+        <w:trPr>
+          <w:cantSplit/>
+        </w:trPr>
+        <w:tc>
+          <w:tcPr>
+            <w:tcW w:type="dxa" w:w="3118"/>
+          </w:tcPr>
+          <w:p>
+            <w:r>
+              <w:t>Đăng nhập và quyền Admin</w:t>
+            </w:r>
+          </w:p>
+        </w:tc>
+        <w:tc>
+          <w:tcPr>
+            <w:tcW w:type="dxa" w:w="6520"/>
+          </w:tcPr>
+          <w:p>
+            <w:r>
+              <w:t>frontend/admin/src/App.tsx</w:t>
+            </w:r>
+          </w:p>
+        </w:tc>
+      </w:tr>
+      <w:tr>
+        <w:trPr>
+          <w:cantSplit/>
+        </w:trPr>
+        <w:tc>
+          <w:tcPr>
+            <w:tcW w:type="dxa" w:w="3118"/>
+          </w:tcPr>
+          <w:p>
+            <w:r>
+              <w:t>Quản lý tài khoản và báo cáo</w:t>
+            </w:r>
+          </w:p>
+        </w:tc>
+        <w:tc>
+          <w:tcPr>
+            <w:tcW w:type="dxa" w:w="6520"/>
+          </w:tcPr>
+          <w:p>
+            <w:r>
+              <w:t>frontend/admin/src/AdminDashboard.tsx</w:t>
+            </w:r>
+          </w:p>
+        </w:tc>
+      </w:tr>
+      <w:tr>
+        <w:trPr>
+          <w:cantSplit/>
+        </w:trPr>
+        <w:tc>
+          <w:tcPr>
+            <w:tcW w:type="dxa" w:w="3118"/>
+          </w:tcPr>
+          <w:p>
+            <w:r>
+              <w:t>Tổng quan và biểu đồ Admin</w:t>
+            </w:r>
+          </w:p>
+        </w:tc>
+        <w:tc>
+          <w:tcPr>
+            <w:tcW w:type="dxa" w:w="6520"/>
+          </w:tcPr>
+          <w:p>
+            <w:r>
+              <w:t>frontend/admin/src/DashboardOverview.tsx</w:t>
+            </w:r>
+          </w:p>
+        </w:tc>
+      </w:tr>
+      <w:tr>
+        <w:trPr>
+          <w:cantSplit/>
+        </w:trPr>
+        <w:tc>
+          <w:tcPr>
+            <w:tcW w:type="dxa" w:w="3118"/>
+          </w:tcPr>
+          <w:p>
+            <w:r>
+              <w:t>Giao diện và ngôn ngữ Admin</w:t>
+            </w:r>
+          </w:p>
+        </w:tc>
+        <w:tc>
+          <w:tcPr>
+            <w:tcW w:type="dxa" w:w="6520"/>
+          </w:tcPr>
+          <w:p>
+            <w:r>
+              <w:t>frontend/admin/src/preferences/PreferenceControls.tsx</w:t>
+            </w:r>
+          </w:p>
+        </w:tc>
+      </w:tr>
     </w:tbl>
     <w:p>
       <w:r>
-        <w:t>Mã CN01–CN12 và CP01–CP12 là mã tham chiếu trong tài liệu, dùng để tra cứu và thảo luận phạm vi chức năng.</w:t>
+        <w:t>CN/CP: chức năng chính/phụ của website. AD/AP: chức năng chính/phụ của Admin. Các mã dùng để tra cứu và thảo luận phạm vi chức năng.</w:t>
       </w:r>
     </w:p>
     <w:sectPr>
@@ -2282,7 +3098,7 @@
       <w:rPr>
         <w:sz w:val="16"/>
       </w:rPr>
-      <w:t xml:space="preserve">Phạm vi: frontend/web  •  Trang </w:t>
+      <w:t xml:space="preserve">Phạm vi: Website và Admin  •  Trang </w:t>
     </w:r>
     <w:fldSimple w:instr="PAGE"/>
   </w:p>
@@ -2298,7 +3114,7 @@
         <w:color w:val="708090"/>
         <w:sz w:val="16"/>
       </w:rPr>
-      <w:t>FOOKBASE LIGHT  /  TÀI LIỆU CHỨC NĂNG WEB</w:t>
+      <w:t>FOOKBASE LIGHT  /  CHỨC NĂNG WEBSITE VÀ TRANG ADMIN</w:t>
     </w:r>
   </w:p>
 </w:hdr>

</xml_diff>

<commit_message>
docs: chuyển mục 13–24 thành chức năng phụ tùy chọn
</commit_message>
<xml_diff>
--- a/docs/chuc-nang-du-an-web.docx
+++ b/docs/chuc-nang-du-an-web.docx
@@ -1814,6 +1814,46 @@
           </w:tcPr>
           <w:p>
             <w:pPr>
+              <w:keepNext/>
+            </w:pPr>
+            <w:r>
+              <w:rPr>
+                <w:b/>
+              </w:rPr>
+              <w:t>III. Các chức năng phụ (tùy chọn)</w:t>
+            </w:r>
+          </w:p>
+          <w:p>
+            <w:pPr>
+              <w:keepNext/>
+            </w:pPr>
+            <w:r>
+              <w:rPr>
+                <w:i/>
+              </w:rPr>
+              <w:t>Các chức năng từ mục 13 đến mục 24 là tùy chọn, chỉ phát triển nếu còn thời gian sau khi hoàn thành các chức năng chính.</w:t>
+            </w:r>
+          </w:p>
+        </w:tc>
+        <w:tc>
+          <w:tcPr>
+            <w:tcW w:type="dxa" w:w="1956"/>
+            <w:vAlign w:val="top"/>
+          </w:tcPr>
+          <w:p/>
+        </w:tc>
+      </w:tr>
+      <w:tr>
+        <w:trPr>
+          <w:cantSplit/>
+        </w:trPr>
+        <w:tc>
+          <w:tcPr>
+            <w:tcW w:type="dxa" w:w="7682"/>
+            <w:vAlign w:val="top"/>
+          </w:tcPr>
+          <w:p>
+            <w:pPr>
               <w:keepNext w:val="0"/>
               <w:ind w:left="140"/>
             </w:pPr>

</xml_diff>